<commit_message>
02/06/2024 14:41 refer to log entry details
</commit_message>
<xml_diff>
--- a/PatientMedicalHistory.docx
+++ b/PatientMedicalHistory.docx
@@ -2501,6 +2501,7 @@
                 <w:rFonts w:ascii="Arial Narrow" w:hAnsi="Arial Narrow" w:cs="Arial Narrow" w:eastAsia="Arial Narrow"/>
                 <w:sz w:val="20"/>
                 <w:b w:val="on"/>
+                <w:color w:val="000000"/>
               </w:rPr>
               <w:t>Allergy</w:t>
             </w:r>
@@ -2531,6 +2532,7 @@
                 <w:rFonts w:ascii="Arial Narrow" w:hAnsi="Arial Narrow" w:cs="Arial Narrow" w:eastAsia="Arial Narrow"/>
                 <w:sz w:val="20"/>
                 <w:b w:val="off"/>
+                <w:color w:val="000000"/>
               </w:rPr>
               <w:t>Adrenalin</w:t>
             </w:r>
@@ -2593,6 +2595,7 @@
                 <w:rFonts w:ascii="Arial Narrow" w:hAnsi="Arial Narrow" w:cs="Arial Narrow" w:eastAsia="Arial Narrow"/>
                 <w:sz w:val="20"/>
                 <w:b w:val="off"/>
+                <w:color w:val="000000"/>
               </w:rPr>
               <w:t>Eczema</w:t>
             </w:r>
@@ -2632,6 +2635,7 @@
                 <w:rFonts w:ascii="Arial Narrow" w:hAnsi="Arial Narrow" w:cs="Arial Narrow" w:eastAsia="Arial Narrow"/>
                 <w:sz w:val="20"/>
                 <w:b w:val="off"/>
+                <w:color w:val="000000"/>
               </w:rPr>
               <w:t>Hay fever</w:t>
             </w:r>
@@ -2676,6 +2680,7 @@
                 <w:rFonts w:ascii="Arial Narrow" w:hAnsi="Arial Narrow" w:cs="Arial Narrow" w:eastAsia="Arial Narrow"/>
                 <w:sz w:val="20"/>
                 <w:b w:val="off"/>
+                <w:color w:val="000000"/>
               </w:rPr>
               <w:t>Latex</w:t>
             </w:r>
@@ -2715,6 +2720,7 @@
                 <w:rFonts w:ascii="Arial Narrow" w:hAnsi="Arial Narrow" w:cs="Arial Narrow" w:eastAsia="Arial Narrow"/>
                 <w:sz w:val="20"/>
                 <w:b w:val="off"/>
+                <w:color w:val="000000"/>
               </w:rPr>
               <w:t>Penecillen</w:t>
             </w:r>
@@ -2756,6 +2762,7 @@
                 <w:rFonts w:ascii="Arial Narrow" w:hAnsi="Arial Narrow" w:cs="Arial Narrow" w:eastAsia="Arial Narrow"/>
                 <w:sz w:val="20"/>
                 <w:b w:val="on"/>
+                <w:color w:val="000000"/>
               </w:rPr>
               <w:t>Arthritus</w:t>
             </w:r>
@@ -2798,6 +2805,7 @@
                 <w:rFonts w:ascii="Arial Narrow" w:hAnsi="Arial Narrow" w:cs="Arial Narrow" w:eastAsia="Arial Narrow"/>
                 <w:sz w:val="20"/>
                 <w:b w:val="on"/>
+                <w:color w:val="000000"/>
               </w:rPr>
               <w:t>Bruise easily/bleed abnormally post injury/surgery</w:t>
             </w:r>
@@ -2845,6 +2853,7 @@
                 <w:rFonts w:ascii="Arial Narrow" w:hAnsi="Arial Narrow" w:cs="Arial Narrow" w:eastAsia="Arial Narrow"/>
                 <w:sz w:val="20"/>
                 <w:b w:val="on"/>
+                <w:color w:val="000000"/>
               </w:rPr>
               <w:t>Chorea (St Vitus dance)</w:t>
             </w:r>
@@ -2887,6 +2896,7 @@
                 <w:rFonts w:ascii="Arial Narrow" w:hAnsi="Arial Narrow" w:cs="Arial Narrow" w:eastAsia="Arial Narrow"/>
                 <w:sz w:val="20"/>
                 <w:b w:val="on"/>
+                <w:color w:val="000000"/>
               </w:rPr>
               <w:t>Cold sores (herpes)</w:t>
             </w:r>
@@ -2934,6 +2944,7 @@
                 <w:rFonts w:ascii="Arial Narrow" w:hAnsi="Arial Narrow" w:cs="Arial Narrow" w:eastAsia="Arial Narrow"/>
                 <w:sz w:val="20"/>
                 <w:b w:val="on"/>
+                <w:color w:val="000000"/>
               </w:rPr>
               <w:t>Diabetes</w:t>
             </w:r>
@@ -2976,6 +2987,7 @@
                 <w:rFonts w:ascii="Arial Narrow" w:hAnsi="Arial Narrow" w:cs="Arial Narrow" w:eastAsia="Arial Narrow"/>
                 <w:sz w:val="20"/>
                 <w:b w:val="on"/>
+                <w:color w:val="000000"/>
               </w:rPr>
               <w:t>Epilepsy</w:t>
             </w:r>
@@ -3023,6 +3035,7 @@
                 <w:rFonts w:ascii="Arial Narrow" w:hAnsi="Arial Narrow" w:cs="Arial Narrow" w:eastAsia="Arial Narrow"/>
                 <w:sz w:val="20"/>
                 <w:b w:val="on"/>
+                <w:color w:val="000000"/>
               </w:rPr>
               <w:t>Fainting attacks, blackouts, giddiness</w:t>
             </w:r>
@@ -3067,6 +3080,7 @@
                 <w:rFonts w:ascii="Arial Narrow" w:hAnsi="Arial Narrow" w:cs="Arial Narrow" w:eastAsia="Arial Narrow"/>
                 <w:sz w:val="20"/>
                 <w:b w:val="on"/>
+                <w:color w:val="000000"/>
               </w:rPr>
               <w:t>Heart-related</w:t>
             </w:r>
@@ -3089,6 +3103,7 @@
                 <w:rFonts w:ascii="Arial Narrow" w:hAnsi="Arial Narrow" w:cs="Arial Narrow" w:eastAsia="Arial Narrow"/>
                 <w:sz w:val="20"/>
                 <w:b w:val="off"/>
+                <w:color w:val="000000"/>
               </w:rPr>
               <w:t>Angina</w:t>
             </w:r>
@@ -3133,6 +3148,7 @@
                 <w:rFonts w:ascii="Arial Narrow" w:hAnsi="Arial Narrow" w:cs="Arial Narrow" w:eastAsia="Arial Narrow"/>
                 <w:sz w:val="20"/>
                 <w:b w:val="off"/>
+                <w:color w:val="000000"/>
               </w:rPr>
               <w:t>Had previous heart surgery</w:t>
             </w:r>
@@ -3172,6 +3188,7 @@
                 <w:rFonts w:ascii="Arial Narrow" w:hAnsi="Arial Narrow" w:cs="Arial Narrow" w:eastAsia="Arial Narrow"/>
                 <w:sz w:val="20"/>
                 <w:b w:val="off"/>
+                <w:color w:val="000000"/>
               </w:rPr>
               <w:t>Have a pacemaker</w:t>
             </w:r>
@@ -3216,6 +3233,7 @@
                 <w:rFonts w:ascii="Arial Narrow" w:hAnsi="Arial Narrow" w:cs="Arial Narrow" w:eastAsia="Arial Narrow"/>
                 <w:sz w:val="20"/>
                 <w:b w:val="off"/>
+                <w:color w:val="000000"/>
               </w:rPr>
               <w:t>Heart murmur</w:t>
             </w:r>
@@ -3255,6 +3273,7 @@
                 <w:rFonts w:ascii="Arial Narrow" w:hAnsi="Arial Narrow" w:cs="Arial Narrow" w:eastAsia="Arial Narrow"/>
                 <w:sz w:val="20"/>
                 <w:b w:val="off"/>
+                <w:color w:val="000000"/>
               </w:rPr>
               <w:t>High blood pressure</w:t>
             </w:r>
@@ -3296,6 +3315,7 @@
                 <w:rFonts w:ascii="Arial Narrow" w:hAnsi="Arial Narrow" w:cs="Arial Narrow" w:eastAsia="Arial Narrow"/>
                 <w:sz w:val="20"/>
                 <w:b w:val="on"/>
+                <w:color w:val="000000"/>
               </w:rPr>
               <w:t>Infectious diseases</w:t>
             </w:r>
@@ -3338,6 +3358,7 @@
                 <w:rFonts w:ascii="Arial Narrow" w:hAnsi="Arial Narrow" w:cs="Arial Narrow" w:eastAsia="Arial Narrow"/>
                 <w:sz w:val="20"/>
                 <w:b w:val="on"/>
+                <w:color w:val="000000"/>
               </w:rPr>
               <w:t>Kidney-related</w:t>
             </w:r>
@@ -3388,6 +3409,7 @@
                 <w:rFonts w:ascii="Arial Narrow" w:hAnsi="Arial Narrow" w:cs="Arial Narrow" w:eastAsia="Arial Narrow"/>
                 <w:sz w:val="20"/>
                 <w:b w:val="on"/>
+                <w:color w:val="000000"/>
               </w:rPr>
               <w:t>Lifestyle</w:t>
             </w:r>
@@ -3409,6 +3431,7 @@
                 <w:rFonts w:ascii="Arial Narrow" w:hAnsi="Arial Narrow" w:cs="Arial Narrow" w:eastAsia="Arial Narrow"/>
                 <w:sz w:val="20"/>
                 <w:b w:val="off"/>
+                <w:color w:val="000000"/>
               </w:rPr>
               <w:t>Alcohol consumed</w:t>
             </w:r>
@@ -3448,6 +3471,7 @@
                 <w:rFonts w:ascii="Arial Narrow" w:hAnsi="Arial Narrow" w:cs="Arial Narrow" w:eastAsia="Arial Narrow"/>
                 <w:sz w:val="20"/>
                 <w:b w:val="off"/>
+                <w:color w:val="000000"/>
               </w:rPr>
               <w:t>Tobacco smoked</w:t>
             </w:r>
@@ -3492,6 +3516,7 @@
                 <w:rFonts w:ascii="Arial Narrow" w:hAnsi="Arial Narrow" w:cs="Arial Narrow" w:eastAsia="Arial Narrow"/>
                 <w:sz w:val="20"/>
                 <w:b w:val="on"/>
+                <w:color w:val="000000"/>
               </w:rPr>
               <w:t>Liver</w:t>
             </w:r>
@@ -3513,6 +3538,7 @@
                 <w:rFonts w:ascii="Arial Narrow" w:hAnsi="Arial Narrow" w:cs="Arial Narrow" w:eastAsia="Arial Narrow"/>
                 <w:sz w:val="20"/>
                 <w:b w:val="off"/>
+                <w:color w:val="000000"/>
               </w:rPr>
               <w:t>Hepatitus</w:t>
             </w:r>
@@ -3552,6 +3578,7 @@
                 <w:rFonts w:ascii="Arial Narrow" w:hAnsi="Arial Narrow" w:cs="Arial Narrow" w:eastAsia="Arial Narrow"/>
                 <w:sz w:val="20"/>
                 <w:b w:val="off"/>
+                <w:color w:val="000000"/>
               </w:rPr>
               <w:t>Jaundice</w:t>
             </w:r>
@@ -3596,6 +3623,7 @@
                 <w:rFonts w:ascii="Arial Narrow" w:hAnsi="Arial Narrow" w:cs="Arial Narrow" w:eastAsia="Arial Narrow"/>
                 <w:sz w:val="20"/>
                 <w:b w:val="on"/>
+                <w:color w:val="000000"/>
               </w:rPr>
               <w:t>Lung</w:t>
             </w:r>
@@ -3617,6 +3645,7 @@
                 <w:rFonts w:ascii="Arial Narrow" w:hAnsi="Arial Narrow" w:cs="Arial Narrow" w:eastAsia="Arial Narrow"/>
                 <w:sz w:val="20"/>
                 <w:b w:val="off"/>
+                <w:color w:val="000000"/>
               </w:rPr>
               <w:t>Asthma</w:t>
             </w:r>
@@ -3656,6 +3685,7 @@
                 <w:rFonts w:ascii="Arial Narrow" w:hAnsi="Arial Narrow" w:cs="Arial Narrow" w:eastAsia="Arial Narrow"/>
                 <w:sz w:val="20"/>
                 <w:b w:val="off"/>
+                <w:color w:val="000000"/>
               </w:rPr>
               <w:t>Bronchitus</w:t>
             </w:r>
@@ -3697,6 +3727,7 @@
                 <w:rFonts w:ascii="Arial Narrow" w:hAnsi="Arial Narrow" w:cs="Arial Narrow" w:eastAsia="Arial Narrow"/>
                 <w:sz w:val="20"/>
                 <w:b w:val="on"/>
+                <w:color w:val="000000"/>
               </w:rPr>
               <w:t>Rheumatic fever</w:t>
             </w:r>
@@ -3739,6 +3770,7 @@
                 <w:rFonts w:ascii="Arial Narrow" w:hAnsi="Arial Narrow" w:cs="Arial Narrow" w:eastAsia="Arial Narrow"/>
                 <w:sz w:val="20"/>
                 <w:b w:val="off"/>
+                <w:color w:val="000000"/>
               </w:rPr>
               <w:t>Other ...</w:t>
             </w:r>

</xml_diff>